<commit_message>
Corregir inconsistencias detectadas en auditoría de calidad
- Figura 2 del EDA mostraba "1990-2013" con datos hasta 2023 (la figura se
  generó antes de hacer dinámico el título); regenerada con el rango real.
- Informe: cifras de XAI, sesgo por cultivo y margen de error del modelo
  ahora se leen del JSON (quedaban valores de la corrida anterior); el
  análisis de sesgo distingue representación vs varianza natural del cultivo.
- Slides regeneradas con la figura corregida.

Co-authored-by: Cursor <cursoragent@cursor.com>
</commit_message>
<xml_diff>
--- a/informe/Informe_Tecnico.docx
+++ b/informe/Informe_Tecnico.docx
@@ -2811,7 +2811,7 @@
         <w:pStyle w:val="ListBullet"/>
       </w:pPr>
       <w:r>
-        <w:t>Sesgo de representación: el dataset sobrerrepresenta países con series estadísticas largas (Cameroon: 340 filas) frente a otros con muy pocas (Seychelles: 34). Ecuador cuenta con 306 filas, una representación intermedia razonable.</w:t>
+        <w:t>Sesgo de representación: el dataset sobrerrepresenta países con series estadísticas completas (Cameroon: 340 filas) frente a otros con muy pocas (Seychelles: 34); y cultivos globales (Maize: 5,120 filas) frente a cultivos regionales (Plantains and others: 1,530). Ecuador cuenta con 306 filas, una representación intermedia razonable.</w:t>
       </w:r>
     </w:p>
     <w:p>
@@ -2827,7 +2827,7 @@
         <w:pStyle w:val="ListBullet"/>
       </w:pPr>
       <w:r>
-        <w:t>Verificación cuantitativa: se midió el error por grupo. El RMSE para Ecuador es de 0.727 ton/ha (mejor que el promedio global de 1.638), por lo que el sesgo no perjudica al mercado objetivo. En cambio, los grupos menos representados sí sufren: Potatoes (4,908 filas) tiene RMSE de 2.863 frente a 0.344 de Soybeans (3,072 filas). Las recomendaciones de los cultivos con mayor error se comunican al negocio con una advertencia explícita de mayor incertidumbre.</w:t>
+        <w:t>Verificación cuantitativa: se midió el error por grupo. El RMSE para Ecuador es de 0.727 ton/ha (mejor que el promedio global de 1.638), por lo que el sesgo no perjudica al mercado objetivo. El error por cultivo varía de 0.344 (Soybeans) a 2.863 (Potatoes); el análisis muestra que ese error se explica sobre todo por la magnitud y varianza del rendimiento de cada cultivo (la papa rinde 5-50 ton/ha según el país; la soya se mueve en un rango estrecho), además de la representación. Las recomendaciones de los cultivos con mayor error se comunican al negocio con una advertencia explícita de mayor incertidumbre.</w:t>
       </w:r>
     </w:p>
     <w:p>
@@ -2857,7 +2857,7 @@
         <w:rPr>
           <w:b w:val="0"/>
         </w:rPr>
-        <w:t>Para que el comité confíe en el algoritmo se calculó la importancia de variables por permutación (cuánto cae el R² al aleatorizar cada variable). El resultado es intuitivo para el negocio: el tipo de cultivo es por lejos el factor dominante (una papa rinde en toneladas mucho más que un trigo), seguido del país (proxy de suelo, tecnología y variedades). Entre los factores accionables/monitoreables, pesticidas (0.18), temperatura (0.11) y lluvia (0.11) tienen pesos comparables. La explicación al negocio: 'el modelo primero ubica el cultivo y el país, y luego ajusta la estimación según el clima y el manejo del año; funciona como lo haría un agrónomo experimentado, pero con la memoria de 34,113 cosechas'.</w:t>
+        <w:t>Para que el comité confíe en el algoritmo se calculó la importancia de variables por permutación (cuánto cae el R² al aleatorizar cada variable). El resultado es intuitivo para el negocio: el tipo de cultivo es por lejos el factor dominante (una papa rinde en toneladas mucho más que un trigo), seguido del país (proxy de suelo, tecnología y variedades). Entre los factores accionables/monitoreables, pesticidas (0.27), temperatura (0.21) y lluvia (0.12) tienen pesos comparables. La explicación al negocio: 'el modelo primero ubica el cultivo y el país, y luego ajusta la estimación según el clima y el manejo del año; funciona como lo haría un agrónomo experimentado, pero con la memoria de 34,113 cosechas'.</w:t>
       </w:r>
     </w:p>
     <w:p>
@@ -2919,7 +2919,7 @@
         <w:rPr>
           <w:b w:val="0"/>
         </w:rPr>
-        <w:t>Gobernanza del modelo: el pipeline completo (preprocesamiento + modelo) se versiona como un único artefacto (modelo_rendimiento.joblib); las predicciones se comunican siempre con su margen de error (±1.11 ton/ha); y la decisión final de compra permanece en el comité humano, con el modelo como apoyo —principio de supervisión humana definido desde la Fase 1.</w:t>
+        <w:t>Gobernanza del modelo: el pipeline completo (preprocesamiento + modelo) se versiona como un único artefacto (modelo_rendimiento.joblib); las predicciones se comunican siempre con su margen de error (±1.638 ton/ha); y la decisión final de compra permanece en el comité humano, con el modelo como apoyo —principio de supervisión humana definido desde la Fase 1.</w:t>
       </w:r>
     </w:p>
     <w:p>

</xml_diff>